<commit_message>
Corrige enlace real del repositorio GitHub
</commit_message>
<xml_diff>
--- a/docs/RSM_Taller_final_10_microservicios_actualizado_informe.docx
+++ b/docs/RSM_Taller_final_10_microservicios_actualizado_informe.docx
@@ -354,7 +354,7 @@
                 <w:b w:val="0"/>
                 <w:sz w:val="22"/>
               </w:rPr>
-              <w:t>https://github.com/joaquin-alvarado/rsm-agente-ep2</w:t>
+              <w:t>https://github.com/elgatomaleante12/rsm-agente-ep2-entrega</w:t>
             </w:r>
           </w:p>
         </w:tc>
@@ -2151,7 +2151,7 @@
                 <w:b w:val="0"/>
                 <w:sz w:val="22"/>
               </w:rPr>
-              <w:t>https://github.com/joaquin-alvarado/rsm-agente-ep2</w:t>
+              <w:t>https://github.com/elgatomaleante12/rsm-agente-ep2-entrega</w:t>
             </w:r>
           </w:p>
         </w:tc>

</xml_diff>

<commit_message>
Quita pie de pagina del informe actualizado
</commit_message>
<xml_diff>
--- a/docs/RSM_Taller_final_10_microservicios_actualizado_informe.docx
+++ b/docs/RSM_Taller_final_10_microservicios_actualizado_informe.docx
@@ -3025,17 +3025,8 @@
   <w:p>
     <w:pPr>
       <w:pStyle w:val="Footer"/>
-      <w:jc w:val="right"/>
     </w:pPr>
-    <w:r>
-      <w:rPr>
-        <w:rFonts w:ascii="Calibri" w:hAnsi="Calibri"/>
-        <w:b w:val="0"/>
-        <w:color w:val="5C6776"/>
-        <w:sz w:val="18"/>
-      </w:rPr>
-      <w:t>RSM | Informe actualizado</w:t>
-    </w:r>
+    <w:r/>
   </w:p>
 </w:ftr>
 </file>

</xml_diff>